<commit_message>
feat: Reflect Articul8 and Coupang HW actual quotes & add HW optimization appendix (5.15억~8.18억)
</commit_message>
<xml_diff>
--- a/docs/2026-08-20_MZC_AI_Fullstack_Strategy_Service_Report.docx
+++ b/docs/2026-08-20_MZC_AI_Fullstack_Strategy_Service_Report.docx
@@ -2488,9 +2488,11 @@
                 <w:color w:val="1E2432"/>
                 <w:sz w:val="15"/>
               </w:rPr>
-              <w:t>• Dell PowerEdge R760 (2 GPU)</w:t>
+              <w:t>• Dell PowerEdge R760/R770 (2 GPU)</w:t>
               <w:br/>
-              <w:t>• 2x RTX 6000 Ada or 리벨리온 NPU</w:t>
+              <w:t>• 2x RTX 6000 Ada (96GB)</w:t>
+              <w:br/>
+              <w:t xml:space="preserve">  or 2x RTX Blackwell (192GB)</w:t>
               <w:br/>
               <w:t>• NVMe SSD (2~4TB) + 10/25GbE</w:t>
               <w:br/>
@@ -2518,9 +2520,9 @@
               </w:rPr>
               <w:t>약 4,500만 ~</w:t>
               <w:br/>
-              <w:t>6,000만 원</w:t>
+              <w:t>7,400만 원</w:t>
               <w:br/>
-              <w:t>(서버/GPU)</w:t>
+              <w:t>(Ada~4.5천/Blackwell~7.4천)</w:t>
             </w:r>
           </w:p>
         </w:tc>
@@ -2647,13 +2649,13 @@
                 <w:color w:val="1E2432"/>
                 <w:sz w:val="15"/>
               </w:rPr>
-              <w:t>• Dell PowerEdge R760xa / XE9640 (4 GPU)</w:t>
+              <w:t>• Dell PowerEdge XE7740 (4x H200 NVL 1대)</w:t>
               <w:br/>
-              <w:t>• 4x L40S 48GB or 퓨리오사AI NPU</w:t>
+              <w:t>• Dell PowerEdge R770 (Compact 3대)</w:t>
               <w:br/>
-              <w:t>• 올플래시 NVMe (20~50TB) + 100GbE</w:t>
+              <w:t>• Dell PowerEdge R570 (Bastion 1대)</w:t>
               <w:br/>
-              <w:t>• OpenShift 3-Node / Nutanix NCI</w:t>
+              <w:t>• 올플래시 NVMe + 25GbE SFP28</w:t>
             </w:r>
           </w:p>
         </w:tc>
@@ -2674,11 +2676,11 @@
                 <w:color w:val="1E2432"/>
                 <w:sz w:val="15"/>
               </w:rPr>
-              <w:t>약 1.5억 ~</w:t>
+              <w:t>약 5.15억 ~</w:t>
               <w:br/>
-              <w:t>2.2억 원</w:t>
+              <w:t>8.18억 원</w:t>
               <w:br/>
-              <w:t>(H/W 별도)</w:t>
+              <w:t>(51,500만~81,800만)</w:t>
             </w:r>
           </w:p>
         </w:tc>
@@ -2808,13 +2810,13 @@
                 <w:color w:val="1E2432"/>
                 <w:sz w:val="15"/>
               </w:rPr>
-              <w:t>• Dell PowerEdge XE9680 (8x H100/B200)</w:t>
+              <w:t>• Dell PowerEdge XE9780 / XE9680 (8x GPU)</w:t>
               <w:br/>
-              <w:t>• Dell PowerScale F900/F710 (100TB~PB)</w:t>
+              <w:t>• 8x H100/H200 or 8x B200/B300 NVL8</w:t>
               <w:br/>
-              <w:t>• 400GbE Spectrum-X / InfiniBand</w:t>
+              <w:t>• Dell PowerScale F710/F900 NVMe</w:t>
               <w:br/>
-              <w:t>• Multi-Cluster OpenShift / Nutanix NKP</w:t>
+              <w:t>• 400GbE BlueField-3 / InfiniBand</w:t>
             </w:r>
           </w:p>
         </w:tc>
@@ -2836,11 +2838,11 @@
                 <w:color w:val="1E2432"/>
                 <w:sz w:val="15"/>
               </w:rPr>
-              <w:t>약 6억 ~</w:t>
+              <w:t>약 15억 ~</w:t>
               <w:br/>
-              <w:t>10억+ 원</w:t>
+              <w:t>30억+ 원/랙</w:t>
               <w:br/>
-              <w:t>(사양별 산정)</w:t>
+              <w:t>(XE9780 B300 실측22.86억)</w:t>
             </w:r>
           </w:p>
         </w:tc>
@@ -7065,6 +7067,683 @@
         <w:t>차세대 엔터프라이즈 LLM 가속 NPU (RNGD) — https://furiosa.ai</w:t>
       </w:r>
     </w:p>
+    <w:p>
+      <w:r>
+        <w:br w:type="page"/>
+      </w:r>
+    </w:p>
+    <w:p>
+      <w:pPr>
+        <w:keepNext/>
+        <w:spacing w:before="440" w:after="80"/>
+      </w:pPr>
+      <w:r>
+        <w:rPr>
+          <w:rFonts w:ascii="맑은 고딕" w:hAnsi="맑은 고딕"/>
+          <w:b/>
+          <w:color w:val="00ABF0"/>
+          <w:sz w:val="29"/>
+        </w:rPr>
+        <w:t xml:space="preserve">제 Appendix 장.  </w:t>
+      </w:r>
+      <w:r>
+        <w:rPr>
+          <w:rFonts w:ascii="맑은 고딕" w:hAnsi="맑은 고딕"/>
+          <w:b/>
+          <w:color w:val="0F172A"/>
+          <w:sz w:val="29"/>
+        </w:rPr>
+        <w:t>부록: Articul8 (A8) 하드웨어 구성 다이어트 및 비용 절감 3가지 방안</w:t>
+      </w:r>
+    </w:p>
+    <w:p>
+      <w:pPr>
+        <w:spacing w:before="80" w:after="160"/>
+      </w:pPr>
+      <w:r>
+        <w:rPr>
+          <w:rFonts w:ascii="맑은 고딕" w:hAnsi="맑은 고딕"/>
+          <w:color w:val="1E2432"/>
+          <w:sz w:val="18"/>
+        </w:rPr>
+        <w:t>Articul8 엔터프라이즈 LLM 구축 시, 초기 도입 예산 부담을 줄이고 고객사의 가상화 인프라 환경에 맞춰 Bastion 노드(1대, 4,020만 원) 및 OpenShift Compact Control 노드(3대, 2억 6,388만 원)를 선택적으로 줄이거나 통합하여 최대 3억 408만 원(약 37%)의 H/W 비용을 절감하는 3가지 아키텍처 다이어트 옵션을 제공합니다.</w:t>
+      </w:r>
+    </w:p>
+    <w:tbl>
+      <w:tblPr>
+        <w:tblW w:type="auto" w:w="0"/>
+        <w:jc w:val="center"/>
+        <w:tblLook w:firstColumn="1" w:firstRow="1" w:lastColumn="0" w:lastRow="0" w:noHBand="0" w:noVBand="1" w:val="04A0"/>
+      </w:tblPr>
+      <w:tblGrid>
+        <w:gridCol w:w="1949"/>
+        <w:gridCol w:w="1949"/>
+        <w:gridCol w:w="1949"/>
+        <w:gridCol w:w="1949"/>
+        <w:gridCol w:w="1949"/>
+      </w:tblGrid>
+      <w:tr>
+        <w:tc>
+          <w:tcPr>
+            <w:tcW w:type="dxa" w:w="1474"/>
+            <w:tcMar>
+              <w:top w:w="100" w:type="dxa"/>
+              <w:bottom w:w="100" w:type="dxa"/>
+              <w:left w:w="80" w:type="dxa"/>
+              <w:right w:w="80" w:type="dxa"/>
+            </w:tcMar>
+            <w:shd w:fill="1F497D"/>
+          </w:tcPr>
+          <w:p>
+            <w:r>
+              <w:rPr>
+                <w:rFonts w:ascii="맑은 고딕" w:hAnsi="맑은 고딕"/>
+                <w:b/>
+                <w:color w:val="FFFFFF"/>
+                <w:sz w:val="16"/>
+              </w:rPr>
+              <w:t>구분 옵션</w:t>
+            </w:r>
+          </w:p>
+        </w:tc>
+        <w:tc>
+          <w:tcPr>
+            <w:tcW w:type="dxa" w:w="2154"/>
+            <w:tcMar>
+              <w:top w:w="100" w:type="dxa"/>
+              <w:bottom w:w="100" w:type="dxa"/>
+              <w:left w:w="80" w:type="dxa"/>
+              <w:right w:w="80" w:type="dxa"/>
+            </w:tcMar>
+            <w:shd w:fill="1F497D"/>
+          </w:tcPr>
+          <w:p>
+            <w:r>
+              <w:rPr>
+                <w:rFonts w:ascii="맑은 고딕" w:hAnsi="맑은 고딕"/>
+                <w:b/>
+                <w:color w:val="FFFFFF"/>
+                <w:sz w:val="16"/>
+              </w:rPr>
+              <w:t>물리 서버 구성 사양</w:t>
+            </w:r>
+          </w:p>
+        </w:tc>
+        <w:tc>
+          <w:tcPr>
+            <w:tcW w:type="dxa" w:w="1587"/>
+            <w:tcMar>
+              <w:top w:w="100" w:type="dxa"/>
+              <w:bottom w:w="100" w:type="dxa"/>
+              <w:left w:w="80" w:type="dxa"/>
+              <w:right w:w="80" w:type="dxa"/>
+            </w:tcMar>
+            <w:shd w:fill="1F497D"/>
+          </w:tcPr>
+          <w:p>
+            <w:r>
+              <w:rPr>
+                <w:rFonts w:ascii="맑은 고딕" w:hAnsi="맑은 고딕"/>
+                <w:b/>
+                <w:color w:val="FFFFFF"/>
+                <w:sz w:val="16"/>
+              </w:rPr>
+              <w:t>H/W 견적가 (VAT별도)</w:t>
+            </w:r>
+          </w:p>
+        </w:tc>
+        <w:tc>
+          <w:tcPr>
+            <w:tcW w:type="dxa" w:w="1361"/>
+            <w:tcMar>
+              <w:top w:w="100" w:type="dxa"/>
+              <w:bottom w:w="100" w:type="dxa"/>
+              <w:left w:w="80" w:type="dxa"/>
+              <w:right w:w="80" w:type="dxa"/>
+            </w:tcMar>
+            <w:shd w:fill="1F497D"/>
+          </w:tcPr>
+          <w:p>
+            <w:r>
+              <w:rPr>
+                <w:rFonts w:ascii="맑은 고딕" w:hAnsi="맑은 고딕"/>
+                <w:b/>
+                <w:color w:val="FFFFFF"/>
+                <w:sz w:val="16"/>
+              </w:rPr>
+              <w:t>비용 절감액</w:t>
+            </w:r>
+          </w:p>
+        </w:tc>
+        <w:tc>
+          <w:tcPr>
+            <w:tcW w:type="dxa" w:w="2268"/>
+            <w:tcMar>
+              <w:top w:w="100" w:type="dxa"/>
+              <w:bottom w:w="100" w:type="dxa"/>
+              <w:left w:w="80" w:type="dxa"/>
+              <w:right w:w="80" w:type="dxa"/>
+            </w:tcMar>
+            <w:shd w:fill="1F497D"/>
+          </w:tcPr>
+          <w:p>
+            <w:r>
+              <w:rPr>
+                <w:rFonts w:ascii="맑은 고딕" w:hAnsi="맑은 고딕"/>
+                <w:b/>
+                <w:color w:val="FFFFFF"/>
+                <w:sz w:val="16"/>
+              </w:rPr>
+              <w:t>특징 및 권장 적용 워크로드</w:t>
+            </w:r>
+          </w:p>
+        </w:tc>
+      </w:tr>
+      <w:tr>
+        <w:tc>
+          <w:tcPr>
+            <w:tcW w:type="dxa" w:w="1474"/>
+            <w:tcMar>
+              <w:top w:w="80" w:type="dxa"/>
+              <w:bottom w:w="80" w:type="dxa"/>
+              <w:left w:w="60" w:type="dxa"/>
+              <w:right w:w="60" w:type="dxa"/>
+            </w:tcMar>
+            <w:shd w:fill="F8FAFC"/>
+          </w:tcPr>
+          <w:p>
+            <w:r>
+              <w:rPr>
+                <w:rFonts w:ascii="맑은 고딕" w:hAnsi="맑은 고딕"/>
+                <w:b/>
+                <w:color w:val="1E2432"/>
+                <w:sz w:val="15"/>
+              </w:rPr>
+              <w:t>기준: Full HA 구성</w:t>
+              <w:br/>
+              <w:t>(풀 패키지)</w:t>
+            </w:r>
+          </w:p>
+        </w:tc>
+        <w:tc>
+          <w:tcPr>
+            <w:tcW w:type="dxa" w:w="2154"/>
+            <w:tcMar>
+              <w:top w:w="80" w:type="dxa"/>
+              <w:bottom w:w="80" w:type="dxa"/>
+              <w:left w:w="60" w:type="dxa"/>
+              <w:right w:w="60" w:type="dxa"/>
+            </w:tcMar>
+            <w:shd w:fill="F8FAFC"/>
+          </w:tcPr>
+          <w:p>
+            <w:r>
+              <w:rPr>
+                <w:rFonts w:ascii="맑은 고딕" w:hAnsi="맑은 고딕"/>
+                <w:color w:val="1E2432"/>
+                <w:sz w:val="15"/>
+              </w:rPr>
+              <w:t>• Dell XE7740 (4x H200) 1대</w:t>
+              <w:br/>
+              <w:t>• Dell R770 Compact 3대</w:t>
+              <w:br/>
+              <w:t>• Dell R570 Bastion 1대 (총 5대)</w:t>
+            </w:r>
+          </w:p>
+        </w:tc>
+        <w:tc>
+          <w:tcPr>
+            <w:tcW w:type="dxa" w:w="1587"/>
+            <w:tcMar>
+              <w:top w:w="80" w:type="dxa"/>
+              <w:bottom w:w="80" w:type="dxa"/>
+              <w:left w:w="60" w:type="dxa"/>
+              <w:right w:w="60" w:type="dxa"/>
+            </w:tcMar>
+            <w:shd w:fill="F8FAFC"/>
+          </w:tcPr>
+          <w:p>
+            <w:r>
+              <w:rPr>
+                <w:rFonts w:ascii="맑은 고딕" w:hAnsi="맑은 고딕"/>
+                <w:color w:val="1E2432"/>
+                <w:sz w:val="15"/>
+              </w:rPr>
+              <w:t>8억 1,793만 원</w:t>
+              <w:br/>
+              <w:t>(81,793만 원)</w:t>
+            </w:r>
+          </w:p>
+        </w:tc>
+        <w:tc>
+          <w:tcPr>
+            <w:tcW w:type="dxa" w:w="1361"/>
+            <w:tcMar>
+              <w:top w:w="80" w:type="dxa"/>
+              <w:bottom w:w="80" w:type="dxa"/>
+              <w:left w:w="60" w:type="dxa"/>
+              <w:right w:w="60" w:type="dxa"/>
+            </w:tcMar>
+            <w:shd w:fill="F8FAFC"/>
+          </w:tcPr>
+          <w:p>
+            <w:r>
+              <w:rPr>
+                <w:rFonts w:ascii="맑은 고딕" w:hAnsi="맑은 고딕"/>
+                <w:color w:val="1E2432"/>
+                <w:sz w:val="15"/>
+              </w:rPr>
+              <w:t>기준가 (0원)</w:t>
+            </w:r>
+          </w:p>
+        </w:tc>
+        <w:tc>
+          <w:tcPr>
+            <w:tcW w:type="dxa" w:w="2268"/>
+            <w:tcMar>
+              <w:top w:w="80" w:type="dxa"/>
+              <w:bottom w:w="80" w:type="dxa"/>
+              <w:left w:w="60" w:type="dxa"/>
+              <w:right w:w="60" w:type="dxa"/>
+            </w:tcMar>
+            <w:shd w:fill="F8FAFC"/>
+          </w:tcPr>
+          <w:p>
+            <w:r>
+              <w:rPr>
+                <w:rFonts w:ascii="맑은 고딕" w:hAnsi="맑은 고딕"/>
+                <w:color w:val="1E2432"/>
+                <w:sz w:val="15"/>
+              </w:rPr>
+              <w:t>• 24x7 미션 크리티컬 무중단</w:t>
+              <w:br/>
+              <w:t>• Control Plane 물리 완전 이중화</w:t>
+            </w:r>
+          </w:p>
+        </w:tc>
+      </w:tr>
+      <w:tr>
+        <w:tc>
+          <w:tcPr>
+            <w:tcW w:type="dxa" w:w="1474"/>
+            <w:tcMar>
+              <w:top w:w="80" w:type="dxa"/>
+              <w:bottom w:w="80" w:type="dxa"/>
+              <w:left w:w="60" w:type="dxa"/>
+              <w:right w:w="60" w:type="dxa"/>
+            </w:tcMar>
+          </w:tcPr>
+          <w:p>
+            <w:r>
+              <w:rPr>
+                <w:rFonts w:ascii="맑은 고딕" w:hAnsi="맑은 고딕"/>
+                <w:b/>
+                <w:color w:val="1E2432"/>
+                <w:sz w:val="15"/>
+              </w:rPr>
+              <w:t>방안 1: SNO 통합</w:t>
+              <w:br/>
+              <w:t>(1-Server 최적) ★추천</w:t>
+            </w:r>
+          </w:p>
+        </w:tc>
+        <w:tc>
+          <w:tcPr>
+            <w:tcW w:type="dxa" w:w="2154"/>
+            <w:tcMar>
+              <w:top w:w="80" w:type="dxa"/>
+              <w:bottom w:w="80" w:type="dxa"/>
+              <w:left w:w="60" w:type="dxa"/>
+              <w:right w:w="60" w:type="dxa"/>
+            </w:tcMar>
+          </w:tcPr>
+          <w:p>
+            <w:r>
+              <w:rPr>
+                <w:rFonts w:ascii="맑은 고딕" w:hAnsi="맑은 고딕"/>
+                <w:color w:val="1E2432"/>
+                <w:sz w:val="15"/>
+              </w:rPr>
+              <w:t>• Dell XE7740 1대 단일 물리서버</w:t>
+              <w:br/>
+              <w:t>• Single Node OpenShift (SNO)</w:t>
+              <w:br/>
+              <w:t>• RHOAI + Articul8 + Bastion 통합</w:t>
+            </w:r>
+          </w:p>
+        </w:tc>
+        <w:tc>
+          <w:tcPr>
+            <w:tcW w:type="dxa" w:w="1587"/>
+            <w:tcMar>
+              <w:top w:w="80" w:type="dxa"/>
+              <w:bottom w:w="80" w:type="dxa"/>
+              <w:left w:w="60" w:type="dxa"/>
+              <w:right w:w="60" w:type="dxa"/>
+            </w:tcMar>
+          </w:tcPr>
+          <w:p>
+            <w:r>
+              <w:rPr>
+                <w:rFonts w:ascii="맑은 고딕" w:hAnsi="맑은 고딕"/>
+                <w:color w:val="1E2432"/>
+                <w:sz w:val="15"/>
+              </w:rPr>
+              <w:t>5억 1,385만 원</w:t>
+              <w:br/>
+              <w:t>(51,385만 원)</w:t>
+            </w:r>
+          </w:p>
+        </w:tc>
+        <w:tc>
+          <w:tcPr>
+            <w:tcW w:type="dxa" w:w="1361"/>
+            <w:tcMar>
+              <w:top w:w="80" w:type="dxa"/>
+              <w:bottom w:w="80" w:type="dxa"/>
+              <w:left w:w="60" w:type="dxa"/>
+              <w:right w:w="60" w:type="dxa"/>
+            </w:tcMar>
+          </w:tcPr>
+          <w:p>
+            <w:r>
+              <w:rPr>
+                <w:rFonts w:ascii="맑은 고딕" w:hAnsi="맑은 고딕"/>
+                <w:b/>
+                <w:color w:val="76B900"/>
+                <w:sz w:val="15"/>
+              </w:rPr>
+              <w:t>▼ 3억 408만 원</w:t>
+              <w:br/>
+              <w:t>(37%↓ 절감)</w:t>
+            </w:r>
+          </w:p>
+        </w:tc>
+        <w:tc>
+          <w:tcPr>
+            <w:tcW w:type="dxa" w:w="2268"/>
+            <w:tcMar>
+              <w:top w:w="80" w:type="dxa"/>
+              <w:bottom w:w="80" w:type="dxa"/>
+              <w:left w:w="60" w:type="dxa"/>
+              <w:right w:w="60" w:type="dxa"/>
+            </w:tcMar>
+          </w:tcPr>
+          <w:p>
+            <w:r>
+              <w:rPr>
+                <w:rFonts w:ascii="맑은 고딕" w:hAnsi="맑은 고딕"/>
+                <w:color w:val="1E2432"/>
+                <w:sz w:val="15"/>
+              </w:rPr>
+              <w:t>• Small-Start / PoC / 초가성비</w:t>
+              <w:br/>
+              <w:t>• 4U 소형화, 랙/전력 최소화</w:t>
+            </w:r>
+          </w:p>
+        </w:tc>
+      </w:tr>
+      <w:tr>
+        <w:tc>
+          <w:tcPr>
+            <w:tcW w:type="dxa" w:w="1474"/>
+            <w:tcMar>
+              <w:top w:w="80" w:type="dxa"/>
+              <w:bottom w:w="80" w:type="dxa"/>
+              <w:left w:w="60" w:type="dxa"/>
+              <w:right w:w="60" w:type="dxa"/>
+            </w:tcMar>
+            <w:shd w:fill="F8FAFC"/>
+          </w:tcPr>
+          <w:p>
+            <w:r>
+              <w:rPr>
+                <w:rFonts w:ascii="맑은 고딕" w:hAnsi="맑은 고딕"/>
+                <w:b/>
+                <w:color w:val="1E2432"/>
+                <w:sz w:val="15"/>
+              </w:rPr>
+              <w:t>방안 2: 사내 VM 활용</w:t>
+              <w:br/>
+              <w:t>(Virtual Control)</w:t>
+            </w:r>
+          </w:p>
+        </w:tc>
+        <w:tc>
+          <w:tcPr>
+            <w:tcW w:type="dxa" w:w="2154"/>
+            <w:tcMar>
+              <w:top w:w="80" w:type="dxa"/>
+              <w:bottom w:w="80" w:type="dxa"/>
+              <w:left w:w="60" w:type="dxa"/>
+              <w:right w:w="60" w:type="dxa"/>
+            </w:tcMar>
+            <w:shd w:fill="F8FAFC"/>
+          </w:tcPr>
+          <w:p>
+            <w:r>
+              <w:rPr>
+                <w:rFonts w:ascii="맑은 고딕" w:hAnsi="맑은 고딕"/>
+                <w:color w:val="1E2432"/>
+                <w:sz w:val="15"/>
+              </w:rPr>
+              <w:t>• Dell XE7740 (4x H200) 1대</w:t>
+              <w:br/>
+              <w:t>• 고객사 기존 VM (vSphere/Nutanix)</w:t>
+              <w:br/>
+              <w:t xml:space="preserve">  Control VM 3대 + Bastion VM 1대</w:t>
+            </w:r>
+          </w:p>
+        </w:tc>
+        <w:tc>
+          <w:tcPr>
+            <w:tcW w:type="dxa" w:w="1587"/>
+            <w:tcMar>
+              <w:top w:w="80" w:type="dxa"/>
+              <w:bottom w:w="80" w:type="dxa"/>
+              <w:left w:w="60" w:type="dxa"/>
+              <w:right w:w="60" w:type="dxa"/>
+            </w:tcMar>
+            <w:shd w:fill="F8FAFC"/>
+          </w:tcPr>
+          <w:p>
+            <w:r>
+              <w:rPr>
+                <w:rFonts w:ascii="맑은 고딕" w:hAnsi="맑은 고딕"/>
+                <w:color w:val="1E2432"/>
+                <w:sz w:val="15"/>
+              </w:rPr>
+              <w:t>5억 1,385만 원</w:t>
+              <w:br/>
+              <w:t>(51,385만 원)</w:t>
+            </w:r>
+          </w:p>
+        </w:tc>
+        <w:tc>
+          <w:tcPr>
+            <w:tcW w:type="dxa" w:w="1361"/>
+            <w:tcMar>
+              <w:top w:w="80" w:type="dxa"/>
+              <w:bottom w:w="80" w:type="dxa"/>
+              <w:left w:w="60" w:type="dxa"/>
+              <w:right w:w="60" w:type="dxa"/>
+            </w:tcMar>
+            <w:shd w:fill="F8FAFC"/>
+          </w:tcPr>
+          <w:p>
+            <w:r>
+              <w:rPr>
+                <w:rFonts w:ascii="맑은 고딕" w:hAnsi="맑은 고딕"/>
+                <w:b/>
+                <w:color w:val="76B900"/>
+                <w:sz w:val="15"/>
+              </w:rPr>
+              <w:t>▼ 3억 408만 원</w:t>
+              <w:br/>
+              <w:t>(37%↓ 절감)</w:t>
+            </w:r>
+          </w:p>
+        </w:tc>
+        <w:tc>
+          <w:tcPr>
+            <w:tcW w:type="dxa" w:w="2268"/>
+            <w:tcMar>
+              <w:top w:w="80" w:type="dxa"/>
+              <w:bottom w:w="80" w:type="dxa"/>
+              <w:left w:w="60" w:type="dxa"/>
+              <w:right w:w="60" w:type="dxa"/>
+            </w:tcMar>
+            <w:shd w:fill="F8FAFC"/>
+          </w:tcPr>
+          <w:p>
+            <w:r>
+              <w:rPr>
+                <w:rFonts w:ascii="맑은 고딕" w:hAnsi="맑은 고딕"/>
+                <w:color w:val="1E2432"/>
+                <w:sz w:val="15"/>
+              </w:rPr>
+              <w:t>• 기존 가상화 인프라 보유 고객사</w:t>
+              <w:br/>
+              <w:t>• H/W 신규구매 최소화 + SW HA</w:t>
+            </w:r>
+          </w:p>
+        </w:tc>
+      </w:tr>
+      <w:tr>
+        <w:tc>
+          <w:tcPr>
+            <w:tcW w:type="dxa" w:w="1474"/>
+            <w:tcMar>
+              <w:top w:w="80" w:type="dxa"/>
+              <w:bottom w:w="80" w:type="dxa"/>
+              <w:left w:w="60" w:type="dxa"/>
+              <w:right w:w="60" w:type="dxa"/>
+            </w:tcMar>
+          </w:tcPr>
+          <w:p>
+            <w:r>
+              <w:rPr>
+                <w:rFonts w:ascii="맑은 고딕" w:hAnsi="맑은 고딕"/>
+                <w:b/>
+                <w:color w:val="1E2432"/>
+                <w:sz w:val="15"/>
+              </w:rPr>
+              <w:t>방안 3: Control 노드</w:t>
+              <w:br/>
+              <w:t>다운사이징</w:t>
+            </w:r>
+          </w:p>
+        </w:tc>
+        <w:tc>
+          <w:tcPr>
+            <w:tcW w:type="dxa" w:w="2154"/>
+            <w:tcMar>
+              <w:top w:w="80" w:type="dxa"/>
+              <w:bottom w:w="80" w:type="dxa"/>
+              <w:left w:w="60" w:type="dxa"/>
+              <w:right w:w="60" w:type="dxa"/>
+            </w:tcMar>
+          </w:tcPr>
+          <w:p>
+            <w:r>
+              <w:rPr>
+                <w:rFonts w:ascii="맑은 고딕" w:hAnsi="맑은 고딕"/>
+                <w:color w:val="1E2432"/>
+                <w:sz w:val="15"/>
+              </w:rPr>
+              <w:t>• Dell XE7740 (4x H200) 1대</w:t>
+              <w:br/>
+              <w:t>• Dell R570 에센셜 3대 (Control)</w:t>
+              <w:br/>
+              <w:t>• Bastion 사내 VM 대체 (총 4대)</w:t>
+            </w:r>
+          </w:p>
+        </w:tc>
+        <w:tc>
+          <w:tcPr>
+            <w:tcW w:type="dxa" w:w="1587"/>
+            <w:tcMar>
+              <w:top w:w="80" w:type="dxa"/>
+              <w:bottom w:w="80" w:type="dxa"/>
+              <w:left w:w="60" w:type="dxa"/>
+              <w:right w:w="60" w:type="dxa"/>
+            </w:tcMar>
+          </w:tcPr>
+          <w:p>
+            <w:r>
+              <w:rPr>
+                <w:rFonts w:ascii="맑은 고딕" w:hAnsi="맑은 고딕"/>
+                <w:color w:val="1E2432"/>
+                <w:sz w:val="15"/>
+              </w:rPr>
+              <w:t>6억 1,885만 원</w:t>
+              <w:br/>
+              <w:t>(61,885만 원)</w:t>
+            </w:r>
+          </w:p>
+        </w:tc>
+        <w:tc>
+          <w:tcPr>
+            <w:tcW w:type="dxa" w:w="1361"/>
+            <w:tcMar>
+              <w:top w:w="80" w:type="dxa"/>
+              <w:bottom w:w="80" w:type="dxa"/>
+              <w:left w:w="60" w:type="dxa"/>
+              <w:right w:w="60" w:type="dxa"/>
+            </w:tcMar>
+          </w:tcPr>
+          <w:p>
+            <w:r>
+              <w:rPr>
+                <w:rFonts w:ascii="맑은 고딕" w:hAnsi="맑은 고딕"/>
+                <w:b/>
+                <w:color w:val="76B900"/>
+                <w:sz w:val="15"/>
+              </w:rPr>
+              <w:t>▼ 1억 9,908만 원</w:t>
+              <w:br/>
+              <w:t>(24%↓ 절감)</w:t>
+            </w:r>
+          </w:p>
+        </w:tc>
+        <w:tc>
+          <w:tcPr>
+            <w:tcW w:type="dxa" w:w="2268"/>
+            <w:tcMar>
+              <w:top w:w="80" w:type="dxa"/>
+              <w:bottom w:w="80" w:type="dxa"/>
+              <w:left w:w="60" w:type="dxa"/>
+              <w:right w:w="60" w:type="dxa"/>
+            </w:tcMar>
+          </w:tcPr>
+          <w:p>
+            <w:r>
+              <w:rPr>
+                <w:rFonts w:ascii="맑은 고딕" w:hAnsi="맑은 고딕"/>
+                <w:color w:val="1E2432"/>
+                <w:sz w:val="15"/>
+              </w:rPr>
+              <w:t>• Control 물리 노드 분리 유지</w:t>
+              <w:br/>
+              <w:t>• 제온 서버 축소로 비용 다이어트</w:t>
+            </w:r>
+          </w:p>
+        </w:tc>
+      </w:tr>
+    </w:tbl>
+    <w:p>
+      <w:pPr>
+        <w:spacing w:before="160" w:after="160"/>
+      </w:pPr>
+      <w:r>
+        <w:rPr>
+          <w:rFonts w:ascii="맑은 고딕" w:hAnsi="맑은 고딕"/>
+          <w:color w:val="1E2432"/>
+          <w:sz w:val="17"/>
+        </w:rPr>
+        <w:t>💡 제안 전략 가이드라인: Option 02 (Medium 티어) 제안 시 고객사의 예산 사정에 따라 최소 사양(SNO / 기존 VM 연동 1-Server: 51,500만 원)부터 풀 사양(Full HA 5-Server: 81,800만 원)까지 유연한 H/W 선택 범위를 제공하여 영업 성공률을 극대화할 수 있습니다.</w:t>
+      </w:r>
+    </w:p>
     <w:sectPr>
       <w:headerReference w:type="default" r:id="rId9"/>
       <w:footerReference w:type="default" r:id="rId10"/>

</xml_diff>